<commit_message>
Adding new template for roza_ud
</commit_message>
<xml_diff>
--- a/templates/roza_ud.docx
+++ b/templates/roza_ud.docx
@@ -1,6 +1,6 @@
 
 <file path=word/document.xml><?xml version="1.0" encoding="utf-8"?>
-<w:document xmlns:wpc="http://schemas.microsoft.com/office/word/2010/wordprocessingCanvas" xmlns:cx="http://schemas.microsoft.com/office/drawing/2014/chartex" xmlns:mc="http://schemas.openxmlformats.org/markup-compatibility/2006" xmlns:o="urn:schemas-microsoft-com:office:office" xmlns:r="http://schemas.openxmlformats.org/officeDocument/2006/relationships" xmlns:m="http://schemas.openxmlformats.org/officeDocument/2006/math" xmlns:v="urn:schemas-microsoft-com:vml" xmlns:wp14="http://schemas.microsoft.com/office/word/2010/wordprocessingDrawing" xmlns:wp="http://schemas.openxmlformats.org/drawingml/2006/wordprocessingDrawing" xmlns:w10="urn:schemas-microsoft-com:office:word" xmlns:w="http://schemas.openxmlformats.org/wordprocessingml/2006/main" xmlns:w14="http://schemas.microsoft.com/office/word/2010/wordml" xmlns:w15="http://schemas.microsoft.com/office/word/2012/wordml" xmlns:w16se="http://schemas.microsoft.com/office/word/2015/wordml/symex" xmlns:wpg="http://schemas.microsoft.com/office/word/2010/wordprocessingGroup" xmlns:wpi="http://schemas.microsoft.com/office/word/2010/wordprocessingInk" xmlns:wne="http://schemas.microsoft.com/office/word/2006/wordml" xmlns:wps="http://schemas.microsoft.com/office/word/2010/wordprocessingShape" mc:Ignorable="w14 w15 w16se wp14">
+<w:document xmlns:wpc="http://schemas.microsoft.com/office/word/2010/wordprocessingCanvas" xmlns:cx="http://schemas.microsoft.com/office/drawing/2014/chartex" xmlns:cx1="http://schemas.microsoft.com/office/drawing/2015/9/8/chartex" xmlns:cx2="http://schemas.microsoft.com/office/drawing/2015/10/21/chartex" xmlns:cx3="http://schemas.microsoft.com/office/drawing/2016/5/9/chartex" xmlns:cx4="http://schemas.microsoft.com/office/drawing/2016/5/10/chartex" xmlns:cx5="http://schemas.microsoft.com/office/drawing/2016/5/11/chartex" xmlns:cx6="http://schemas.microsoft.com/office/drawing/2016/5/12/chartex" xmlns:cx7="http://schemas.microsoft.com/office/drawing/2016/5/13/chartex" xmlns:cx8="http://schemas.microsoft.com/office/drawing/2016/5/14/chartex" xmlns:mc="http://schemas.openxmlformats.org/markup-compatibility/2006" xmlns:aink="http://schemas.microsoft.com/office/drawing/2016/ink" xmlns:am3d="http://schemas.microsoft.com/office/drawing/2017/model3d" xmlns:o="urn:schemas-microsoft-com:office:office" xmlns:oel="http://schemas.microsoft.com/office/2019/extlst" xmlns:r="http://schemas.openxmlformats.org/officeDocument/2006/relationships" xmlns:m="http://schemas.openxmlformats.org/officeDocument/2006/math" xmlns:v="urn:schemas-microsoft-com:vml" xmlns:wp14="http://schemas.microsoft.com/office/word/2010/wordprocessingDrawing" xmlns:wp="http://schemas.openxmlformats.org/drawingml/2006/wordprocessingDrawing" xmlns:w10="urn:schemas-microsoft-com:office:word" xmlns:w="http://schemas.openxmlformats.org/wordprocessingml/2006/main" xmlns:w14="http://schemas.microsoft.com/office/word/2010/wordml" xmlns:w15="http://schemas.microsoft.com/office/word/2012/wordml" xmlns:w16cex="http://schemas.microsoft.com/office/word/2018/wordml/cex" xmlns:w16cid="http://schemas.microsoft.com/office/word/2016/wordml/cid" xmlns:w16="http://schemas.microsoft.com/office/word/2018/wordml" xmlns:w16sdtdh="http://schemas.microsoft.com/office/word/2020/wordml/sdtdatahash" xmlns:w16se="http://schemas.microsoft.com/office/word/2015/wordml/symex" xmlns:wpg="http://schemas.microsoft.com/office/word/2010/wordprocessingGroup" xmlns:wpi="http://schemas.microsoft.com/office/word/2010/wordprocessingInk" xmlns:wne="http://schemas.microsoft.com/office/word/2006/wordml" xmlns:wps="http://schemas.microsoft.com/office/word/2010/wordprocessingShape" mc:Ignorable="w14 w15 w16se w16cid w16 w16cex w16sdtdh wp14">
   <w:background w:color="FFFFFF"/>
   <w:body>
     <w:tbl>
@@ -284,12 +284,6 @@
               <w:gridCol w:w="1335"/>
             </w:tblGrid>
             <w:tr>
-              <w:tblPrEx>
-                <w:tblCellMar>
-                  <w:top w:w="0" w:type="dxa"/>
-                  <w:bottom w:w="0" w:type="dxa"/>
-                </w:tblCellMar>
-              </w:tblPrEx>
               <w:trPr>
                 <w:trHeight w:val="2159"/>
               </w:trPr>
@@ -727,22 +721,6 @@
           <w:p>
             <w:pPr>
               <w:suppressAutoHyphens w:val="0"/>
-              <w:ind w:left="342"/>
-              <w:jc w:val="center"/>
-              <w:rPr>
-                <w:rFonts w:eastAsia="Calibri"/>
-                <w:b/>
-                <w:bCs/>
-                <w:sz w:val="24"/>
-                <w:szCs w:val="24"/>
-                <w:u w:val="single"/>
-                <w:lang w:eastAsia="en-US"/>
-              </w:rPr>
-            </w:pPr>
-          </w:p>
-          <w:p>
-            <w:pPr>
-              <w:suppressAutoHyphens w:val="0"/>
               <w:spacing w:before="120"/>
               <w:ind w:left="342"/>
               <w:jc w:val="center"/>
@@ -863,22 +841,6 @@
               </w:rPr>
               <w:t>присвоена квалификация</w:t>
             </w:r>
-          </w:p>
-          <w:p>
-            <w:pPr>
-              <w:suppressAutoHyphens w:val="0"/>
-              <w:ind w:left="342"/>
-              <w:jc w:val="both"/>
-              <w:rPr>
-                <w:rFonts w:eastAsia="Calibri"/>
-                <w:b/>
-                <w:bCs/>
-                <w:sz w:val="24"/>
-                <w:szCs w:val="24"/>
-                <w:u w:val="single"/>
-                <w:lang w:eastAsia="en-US"/>
-              </w:rPr>
-            </w:pPr>
           </w:p>
           <w:p>
             <w:pPr>
@@ -1365,18 +1327,7 @@
                 <w:szCs w:val="22"/>
                 <w:lang w:eastAsia="en-US"/>
               </w:rPr>
-              <w:t>квалификационной комисс</w:t>
-            </w:r>
-            <w:bookmarkStart w:id="0" w:name="_GoBack"/>
-            <w:bookmarkEnd w:id="0"/>
-            <w:r>
-              <w:rPr>
-                <w:rFonts w:eastAsia="Calibri"/>
-                <w:sz w:val="24"/>
-                <w:szCs w:val="22"/>
-                <w:lang w:eastAsia="en-US"/>
-              </w:rPr>
-              <w:t>ии ____________</w:t>
+              <w:t>квалификационной комиссии ____________</w:t>
             </w:r>
           </w:p>
         </w:tc>
@@ -1980,6 +1931,12 @@
       </w:pPr>
     </w:p>
     <w:sectPr>
+      <w:headerReference w:type="even" r:id="rId8"/>
+      <w:headerReference w:type="default" r:id="rId9"/>
+      <w:footerReference w:type="even" r:id="rId10"/>
+      <w:footerReference w:type="default" r:id="rId11"/>
+      <w:headerReference w:type="first" r:id="rId12"/>
+      <w:footerReference w:type="first" r:id="rId13"/>
       <w:pgSz w:w="11906" w:h="16838"/>
       <w:pgMar w:top="142" w:right="284" w:bottom="142" w:left="284" w:header="720" w:footer="720" w:gutter="0"/>
       <w:cols w:space="720"/>
@@ -1989,8 +1946,106 @@
 </w:document>
 </file>
 
+<file path=word/endnotes.xml><?xml version="1.0" encoding="utf-8"?>
+<w:endnotes xmlns:wpc="http://schemas.microsoft.com/office/word/2010/wordprocessingCanvas" xmlns:cx="http://schemas.microsoft.com/office/drawing/2014/chartex" xmlns:cx1="http://schemas.microsoft.com/office/drawing/2015/9/8/chartex" xmlns:cx2="http://schemas.microsoft.com/office/drawing/2015/10/21/chartex" xmlns:cx3="http://schemas.microsoft.com/office/drawing/2016/5/9/chartex" xmlns:cx4="http://schemas.microsoft.com/office/drawing/2016/5/10/chartex" xmlns:cx5="http://schemas.microsoft.com/office/drawing/2016/5/11/chartex" xmlns:cx6="http://schemas.microsoft.com/office/drawing/2016/5/12/chartex" xmlns:cx7="http://schemas.microsoft.com/office/drawing/2016/5/13/chartex" xmlns:cx8="http://schemas.microsoft.com/office/drawing/2016/5/14/chartex" xmlns:mc="http://schemas.openxmlformats.org/markup-compatibility/2006" xmlns:aink="http://schemas.microsoft.com/office/drawing/2016/ink" xmlns:am3d="http://schemas.microsoft.com/office/drawing/2017/model3d" xmlns:o="urn:schemas-microsoft-com:office:office" xmlns:oel="http://schemas.microsoft.com/office/2019/extlst" xmlns:r="http://schemas.openxmlformats.org/officeDocument/2006/relationships" xmlns:m="http://schemas.openxmlformats.org/officeDocument/2006/math" xmlns:v="urn:schemas-microsoft-com:vml" xmlns:wp14="http://schemas.microsoft.com/office/word/2010/wordprocessingDrawing" xmlns:wp="http://schemas.openxmlformats.org/drawingml/2006/wordprocessingDrawing" xmlns:w10="urn:schemas-microsoft-com:office:word" xmlns:w="http://schemas.openxmlformats.org/wordprocessingml/2006/main" xmlns:w14="http://schemas.microsoft.com/office/word/2010/wordml" xmlns:w15="http://schemas.microsoft.com/office/word/2012/wordml" xmlns:w16cex="http://schemas.microsoft.com/office/word/2018/wordml/cex" xmlns:w16cid="http://schemas.microsoft.com/office/word/2016/wordml/cid" xmlns:w16="http://schemas.microsoft.com/office/word/2018/wordml" xmlns:w16sdtdh="http://schemas.microsoft.com/office/word/2020/wordml/sdtdatahash" xmlns:w16se="http://schemas.microsoft.com/office/word/2015/wordml/symex" xmlns:wpg="http://schemas.microsoft.com/office/word/2010/wordprocessingGroup" xmlns:wpi="http://schemas.microsoft.com/office/word/2010/wordprocessingInk" xmlns:wne="http://schemas.microsoft.com/office/word/2006/wordml" xmlns:wps="http://schemas.microsoft.com/office/word/2010/wordprocessingShape" mc:Ignorable="w14 w15 w16se w16cid w16 w16cex w16sdtdh wp14">
+  <w:endnote w:type="separator" w:id="-1">
+    <w:p>
+      <w:r>
+        <w:separator/>
+      </w:r>
+    </w:p>
+  </w:endnote>
+  <w:endnote w:type="continuationSeparator" w:id="0">
+    <w:p>
+      <w:r>
+        <w:continuationSeparator/>
+      </w:r>
+    </w:p>
+  </w:endnote>
+</w:endnotes>
+</file>
+
+<file path=word/footer1.xml><?xml version="1.0" encoding="utf-8"?>
+<w:ftr xmlns:wpc="http://schemas.microsoft.com/office/word/2010/wordprocessingCanvas" xmlns:cx="http://schemas.microsoft.com/office/drawing/2014/chartex" xmlns:cx1="http://schemas.microsoft.com/office/drawing/2015/9/8/chartex" xmlns:cx2="http://schemas.microsoft.com/office/drawing/2015/10/21/chartex" xmlns:cx3="http://schemas.microsoft.com/office/drawing/2016/5/9/chartex" xmlns:cx4="http://schemas.microsoft.com/office/drawing/2016/5/10/chartex" xmlns:cx5="http://schemas.microsoft.com/office/drawing/2016/5/11/chartex" xmlns:cx6="http://schemas.microsoft.com/office/drawing/2016/5/12/chartex" xmlns:cx7="http://schemas.microsoft.com/office/drawing/2016/5/13/chartex" xmlns:cx8="http://schemas.microsoft.com/office/drawing/2016/5/14/chartex" xmlns:mc="http://schemas.openxmlformats.org/markup-compatibility/2006" xmlns:aink="http://schemas.microsoft.com/office/drawing/2016/ink" xmlns:am3d="http://schemas.microsoft.com/office/drawing/2017/model3d" xmlns:o="urn:schemas-microsoft-com:office:office" xmlns:oel="http://schemas.microsoft.com/office/2019/extlst" xmlns:r="http://schemas.openxmlformats.org/officeDocument/2006/relationships" xmlns:m="http://schemas.openxmlformats.org/officeDocument/2006/math" xmlns:v="urn:schemas-microsoft-com:vml" xmlns:wp14="http://schemas.microsoft.com/office/word/2010/wordprocessingDrawing" xmlns:wp="http://schemas.openxmlformats.org/drawingml/2006/wordprocessingDrawing" xmlns:w10="urn:schemas-microsoft-com:office:word" xmlns:w="http://schemas.openxmlformats.org/wordprocessingml/2006/main" xmlns:w14="http://schemas.microsoft.com/office/word/2010/wordml" xmlns:w15="http://schemas.microsoft.com/office/word/2012/wordml" xmlns:w16cex="http://schemas.microsoft.com/office/word/2018/wordml/cex" xmlns:w16cid="http://schemas.microsoft.com/office/word/2016/wordml/cid" xmlns:w16="http://schemas.microsoft.com/office/word/2018/wordml" xmlns:w16sdtdh="http://schemas.microsoft.com/office/word/2020/wordml/sdtdatahash" xmlns:w16se="http://schemas.microsoft.com/office/word/2015/wordml/symex" xmlns:wpg="http://schemas.microsoft.com/office/word/2010/wordprocessingGroup" xmlns:wpi="http://schemas.microsoft.com/office/word/2010/wordprocessingInk" xmlns:wne="http://schemas.microsoft.com/office/word/2006/wordml" xmlns:wps="http://schemas.microsoft.com/office/word/2010/wordprocessingShape" mc:Ignorable="w14 w15 w16se w16cid w16 w16cex w16sdtdh wp14">
+  <w:p>
+    <w:pPr>
+      <w:pStyle w:val="Footer"/>
+    </w:pPr>
+  </w:p>
+</w:ftr>
+</file>
+
+<file path=word/footer2.xml><?xml version="1.0" encoding="utf-8"?>
+<w:ftr xmlns:wpc="http://schemas.microsoft.com/office/word/2010/wordprocessingCanvas" xmlns:cx="http://schemas.microsoft.com/office/drawing/2014/chartex" xmlns:cx1="http://schemas.microsoft.com/office/drawing/2015/9/8/chartex" xmlns:cx2="http://schemas.microsoft.com/office/drawing/2015/10/21/chartex" xmlns:cx3="http://schemas.microsoft.com/office/drawing/2016/5/9/chartex" xmlns:cx4="http://schemas.microsoft.com/office/drawing/2016/5/10/chartex" xmlns:cx5="http://schemas.microsoft.com/office/drawing/2016/5/11/chartex" xmlns:cx6="http://schemas.microsoft.com/office/drawing/2016/5/12/chartex" xmlns:cx7="http://schemas.microsoft.com/office/drawing/2016/5/13/chartex" xmlns:cx8="http://schemas.microsoft.com/office/drawing/2016/5/14/chartex" xmlns:mc="http://schemas.openxmlformats.org/markup-compatibility/2006" xmlns:aink="http://schemas.microsoft.com/office/drawing/2016/ink" xmlns:am3d="http://schemas.microsoft.com/office/drawing/2017/model3d" xmlns:o="urn:schemas-microsoft-com:office:office" xmlns:oel="http://schemas.microsoft.com/office/2019/extlst" xmlns:r="http://schemas.openxmlformats.org/officeDocument/2006/relationships" xmlns:m="http://schemas.openxmlformats.org/officeDocument/2006/math" xmlns:v="urn:schemas-microsoft-com:vml" xmlns:wp14="http://schemas.microsoft.com/office/word/2010/wordprocessingDrawing" xmlns:wp="http://schemas.openxmlformats.org/drawingml/2006/wordprocessingDrawing" xmlns:w10="urn:schemas-microsoft-com:office:word" xmlns:w="http://schemas.openxmlformats.org/wordprocessingml/2006/main" xmlns:w14="http://schemas.microsoft.com/office/word/2010/wordml" xmlns:w15="http://schemas.microsoft.com/office/word/2012/wordml" xmlns:w16cex="http://schemas.microsoft.com/office/word/2018/wordml/cex" xmlns:w16cid="http://schemas.microsoft.com/office/word/2016/wordml/cid" xmlns:w16="http://schemas.microsoft.com/office/word/2018/wordml" xmlns:w16sdtdh="http://schemas.microsoft.com/office/word/2020/wordml/sdtdatahash" xmlns:w16se="http://schemas.microsoft.com/office/word/2015/wordml/symex" xmlns:wpg="http://schemas.microsoft.com/office/word/2010/wordprocessingGroup" xmlns:wpi="http://schemas.microsoft.com/office/word/2010/wordprocessingInk" xmlns:wne="http://schemas.microsoft.com/office/word/2006/wordml" xmlns:wps="http://schemas.microsoft.com/office/word/2010/wordprocessingShape" mc:Ignorable="w14 w15 w16se w16cid w16 w16cex w16sdtdh wp14">
+  <w:p>
+    <w:pPr>
+      <w:pStyle w:val="Footer"/>
+    </w:pPr>
+  </w:p>
+</w:ftr>
+</file>
+
+<file path=word/footer3.xml><?xml version="1.0" encoding="utf-8"?>
+<w:ftr xmlns:wpc="http://schemas.microsoft.com/office/word/2010/wordprocessingCanvas" xmlns:cx="http://schemas.microsoft.com/office/drawing/2014/chartex" xmlns:cx1="http://schemas.microsoft.com/office/drawing/2015/9/8/chartex" xmlns:cx2="http://schemas.microsoft.com/office/drawing/2015/10/21/chartex" xmlns:cx3="http://schemas.microsoft.com/office/drawing/2016/5/9/chartex" xmlns:cx4="http://schemas.microsoft.com/office/drawing/2016/5/10/chartex" xmlns:cx5="http://schemas.microsoft.com/office/drawing/2016/5/11/chartex" xmlns:cx6="http://schemas.microsoft.com/office/drawing/2016/5/12/chartex" xmlns:cx7="http://schemas.microsoft.com/office/drawing/2016/5/13/chartex" xmlns:cx8="http://schemas.microsoft.com/office/drawing/2016/5/14/chartex" xmlns:mc="http://schemas.openxmlformats.org/markup-compatibility/2006" xmlns:aink="http://schemas.microsoft.com/office/drawing/2016/ink" xmlns:am3d="http://schemas.microsoft.com/office/drawing/2017/model3d" xmlns:o="urn:schemas-microsoft-com:office:office" xmlns:oel="http://schemas.microsoft.com/office/2019/extlst" xmlns:r="http://schemas.openxmlformats.org/officeDocument/2006/relationships" xmlns:m="http://schemas.openxmlformats.org/officeDocument/2006/math" xmlns:v="urn:schemas-microsoft-com:vml" xmlns:wp14="http://schemas.microsoft.com/office/word/2010/wordprocessingDrawing" xmlns:wp="http://schemas.openxmlformats.org/drawingml/2006/wordprocessingDrawing" xmlns:w10="urn:schemas-microsoft-com:office:word" xmlns:w="http://schemas.openxmlformats.org/wordprocessingml/2006/main" xmlns:w14="http://schemas.microsoft.com/office/word/2010/wordml" xmlns:w15="http://schemas.microsoft.com/office/word/2012/wordml" xmlns:w16cex="http://schemas.microsoft.com/office/word/2018/wordml/cex" xmlns:w16cid="http://schemas.microsoft.com/office/word/2016/wordml/cid" xmlns:w16="http://schemas.microsoft.com/office/word/2018/wordml" xmlns:w16sdtdh="http://schemas.microsoft.com/office/word/2020/wordml/sdtdatahash" xmlns:w16se="http://schemas.microsoft.com/office/word/2015/wordml/symex" xmlns:wpg="http://schemas.microsoft.com/office/word/2010/wordprocessingGroup" xmlns:wpi="http://schemas.microsoft.com/office/word/2010/wordprocessingInk" xmlns:wne="http://schemas.microsoft.com/office/word/2006/wordml" xmlns:wps="http://schemas.microsoft.com/office/word/2010/wordprocessingShape" mc:Ignorable="w14 w15 w16se w16cid w16 w16cex w16sdtdh wp14">
+  <w:p>
+    <w:pPr>
+      <w:pStyle w:val="Footer"/>
+    </w:pPr>
+  </w:p>
+</w:ftr>
+</file>
+
+<file path=word/footnotes.xml><?xml version="1.0" encoding="utf-8"?>
+<w:footnotes xmlns:wpc="http://schemas.microsoft.com/office/word/2010/wordprocessingCanvas" xmlns:cx="http://schemas.microsoft.com/office/drawing/2014/chartex" xmlns:cx1="http://schemas.microsoft.com/office/drawing/2015/9/8/chartex" xmlns:cx2="http://schemas.microsoft.com/office/drawing/2015/10/21/chartex" xmlns:cx3="http://schemas.microsoft.com/office/drawing/2016/5/9/chartex" xmlns:cx4="http://schemas.microsoft.com/office/drawing/2016/5/10/chartex" xmlns:cx5="http://schemas.microsoft.com/office/drawing/2016/5/11/chartex" xmlns:cx6="http://schemas.microsoft.com/office/drawing/2016/5/12/chartex" xmlns:cx7="http://schemas.microsoft.com/office/drawing/2016/5/13/chartex" xmlns:cx8="http://schemas.microsoft.com/office/drawing/2016/5/14/chartex" xmlns:mc="http://schemas.openxmlformats.org/markup-compatibility/2006" xmlns:aink="http://schemas.microsoft.com/office/drawing/2016/ink" xmlns:am3d="http://schemas.microsoft.com/office/drawing/2017/model3d" xmlns:o="urn:schemas-microsoft-com:office:office" xmlns:oel="http://schemas.microsoft.com/office/2019/extlst" xmlns:r="http://schemas.openxmlformats.org/officeDocument/2006/relationships" xmlns:m="http://schemas.openxmlformats.org/officeDocument/2006/math" xmlns:v="urn:schemas-microsoft-com:vml" xmlns:wp14="http://schemas.microsoft.com/office/word/2010/wordprocessingDrawing" xmlns:wp="http://schemas.openxmlformats.org/drawingml/2006/wordprocessingDrawing" xmlns:w10="urn:schemas-microsoft-com:office:word" xmlns:w="http://schemas.openxmlformats.org/wordprocessingml/2006/main" xmlns:w14="http://schemas.microsoft.com/office/word/2010/wordml" xmlns:w15="http://schemas.microsoft.com/office/word/2012/wordml" xmlns:w16cex="http://schemas.microsoft.com/office/word/2018/wordml/cex" xmlns:w16cid="http://schemas.microsoft.com/office/word/2016/wordml/cid" xmlns:w16="http://schemas.microsoft.com/office/word/2018/wordml" xmlns:w16sdtdh="http://schemas.microsoft.com/office/word/2020/wordml/sdtdatahash" xmlns:w16se="http://schemas.microsoft.com/office/word/2015/wordml/symex" xmlns:wpg="http://schemas.microsoft.com/office/word/2010/wordprocessingGroup" xmlns:wpi="http://schemas.microsoft.com/office/word/2010/wordprocessingInk" xmlns:wne="http://schemas.microsoft.com/office/word/2006/wordml" xmlns:wps="http://schemas.microsoft.com/office/word/2010/wordprocessingShape" mc:Ignorable="w14 w15 w16se w16cid w16 w16cex w16sdtdh wp14">
+  <w:footnote w:type="separator" w:id="-1">
+    <w:p>
+      <w:r>
+        <w:separator/>
+      </w:r>
+    </w:p>
+  </w:footnote>
+  <w:footnote w:type="continuationSeparator" w:id="0">
+    <w:p>
+      <w:r>
+        <w:continuationSeparator/>
+      </w:r>
+    </w:p>
+  </w:footnote>
+</w:footnotes>
+</file>
+
+<file path=word/header1.xml><?xml version="1.0" encoding="utf-8"?>
+<w:hdr xmlns:wpc="http://schemas.microsoft.com/office/word/2010/wordprocessingCanvas" xmlns:cx="http://schemas.microsoft.com/office/drawing/2014/chartex" xmlns:cx1="http://schemas.microsoft.com/office/drawing/2015/9/8/chartex" xmlns:cx2="http://schemas.microsoft.com/office/drawing/2015/10/21/chartex" xmlns:cx3="http://schemas.microsoft.com/office/drawing/2016/5/9/chartex" xmlns:cx4="http://schemas.microsoft.com/office/drawing/2016/5/10/chartex" xmlns:cx5="http://schemas.microsoft.com/office/drawing/2016/5/11/chartex" xmlns:cx6="http://schemas.microsoft.com/office/drawing/2016/5/12/chartex" xmlns:cx7="http://schemas.microsoft.com/office/drawing/2016/5/13/chartex" xmlns:cx8="http://schemas.microsoft.com/office/drawing/2016/5/14/chartex" xmlns:mc="http://schemas.openxmlformats.org/markup-compatibility/2006" xmlns:aink="http://schemas.microsoft.com/office/drawing/2016/ink" xmlns:am3d="http://schemas.microsoft.com/office/drawing/2017/model3d" xmlns:o="urn:schemas-microsoft-com:office:office" xmlns:oel="http://schemas.microsoft.com/office/2019/extlst" xmlns:r="http://schemas.openxmlformats.org/officeDocument/2006/relationships" xmlns:m="http://schemas.openxmlformats.org/officeDocument/2006/math" xmlns:v="urn:schemas-microsoft-com:vml" xmlns:wp14="http://schemas.microsoft.com/office/word/2010/wordprocessingDrawing" xmlns:wp="http://schemas.openxmlformats.org/drawingml/2006/wordprocessingDrawing" xmlns:w10="urn:schemas-microsoft-com:office:word" xmlns:w="http://schemas.openxmlformats.org/wordprocessingml/2006/main" xmlns:w14="http://schemas.microsoft.com/office/word/2010/wordml" xmlns:w15="http://schemas.microsoft.com/office/word/2012/wordml" xmlns:w16cex="http://schemas.microsoft.com/office/word/2018/wordml/cex" xmlns:w16cid="http://schemas.microsoft.com/office/word/2016/wordml/cid" xmlns:w16="http://schemas.microsoft.com/office/word/2018/wordml" xmlns:w16sdtdh="http://schemas.microsoft.com/office/word/2020/wordml/sdtdatahash" xmlns:w16se="http://schemas.microsoft.com/office/word/2015/wordml/symex" xmlns:wpg="http://schemas.microsoft.com/office/word/2010/wordprocessingGroup" xmlns:wpi="http://schemas.microsoft.com/office/word/2010/wordprocessingInk" xmlns:wne="http://schemas.microsoft.com/office/word/2006/wordml" xmlns:wps="http://schemas.microsoft.com/office/word/2010/wordprocessingShape" mc:Ignorable="w14 w15 w16se w16cid w16 w16cex w16sdtdh wp14">
+  <w:p>
+    <w:pPr>
+      <w:pStyle w:val="Header"/>
+    </w:pPr>
+  </w:p>
+</w:hdr>
+</file>
+
+<file path=word/header2.xml><?xml version="1.0" encoding="utf-8"?>
+<w:hdr xmlns:wpc="http://schemas.microsoft.com/office/word/2010/wordprocessingCanvas" xmlns:cx="http://schemas.microsoft.com/office/drawing/2014/chartex" xmlns:cx1="http://schemas.microsoft.com/office/drawing/2015/9/8/chartex" xmlns:cx2="http://schemas.microsoft.com/office/drawing/2015/10/21/chartex" xmlns:cx3="http://schemas.microsoft.com/office/drawing/2016/5/9/chartex" xmlns:cx4="http://schemas.microsoft.com/office/drawing/2016/5/10/chartex" xmlns:cx5="http://schemas.microsoft.com/office/drawing/2016/5/11/chartex" xmlns:cx6="http://schemas.microsoft.com/office/drawing/2016/5/12/chartex" xmlns:cx7="http://schemas.microsoft.com/office/drawing/2016/5/13/chartex" xmlns:cx8="http://schemas.microsoft.com/office/drawing/2016/5/14/chartex" xmlns:mc="http://schemas.openxmlformats.org/markup-compatibility/2006" xmlns:aink="http://schemas.microsoft.com/office/drawing/2016/ink" xmlns:am3d="http://schemas.microsoft.com/office/drawing/2017/model3d" xmlns:o="urn:schemas-microsoft-com:office:office" xmlns:oel="http://schemas.microsoft.com/office/2019/extlst" xmlns:r="http://schemas.openxmlformats.org/officeDocument/2006/relationships" xmlns:m="http://schemas.openxmlformats.org/officeDocument/2006/math" xmlns:v="urn:schemas-microsoft-com:vml" xmlns:wp14="http://schemas.microsoft.com/office/word/2010/wordprocessingDrawing" xmlns:wp="http://schemas.openxmlformats.org/drawingml/2006/wordprocessingDrawing" xmlns:w10="urn:schemas-microsoft-com:office:word" xmlns:w="http://schemas.openxmlformats.org/wordprocessingml/2006/main" xmlns:w14="http://schemas.microsoft.com/office/word/2010/wordml" xmlns:w15="http://schemas.microsoft.com/office/word/2012/wordml" xmlns:w16cex="http://schemas.microsoft.com/office/word/2018/wordml/cex" xmlns:w16cid="http://schemas.microsoft.com/office/word/2016/wordml/cid" xmlns:w16="http://schemas.microsoft.com/office/word/2018/wordml" xmlns:w16sdtdh="http://schemas.microsoft.com/office/word/2020/wordml/sdtdatahash" xmlns:w16se="http://schemas.microsoft.com/office/word/2015/wordml/symex" xmlns:wpg="http://schemas.microsoft.com/office/word/2010/wordprocessingGroup" xmlns:wpi="http://schemas.microsoft.com/office/word/2010/wordprocessingInk" xmlns:wne="http://schemas.microsoft.com/office/word/2006/wordml" xmlns:wps="http://schemas.microsoft.com/office/word/2010/wordprocessingShape" mc:Ignorable="w14 w15 w16se w16cid w16 w16cex w16sdtdh wp14">
+  <w:p>
+    <w:pPr>
+      <w:pStyle w:val="Header"/>
+    </w:pPr>
+  </w:p>
+</w:hdr>
+</file>
+
+<file path=word/header3.xml><?xml version="1.0" encoding="utf-8"?>
+<w:hdr xmlns:wpc="http://schemas.microsoft.com/office/word/2010/wordprocessingCanvas" xmlns:cx="http://schemas.microsoft.com/office/drawing/2014/chartex" xmlns:cx1="http://schemas.microsoft.com/office/drawing/2015/9/8/chartex" xmlns:cx2="http://schemas.microsoft.com/office/drawing/2015/10/21/chartex" xmlns:cx3="http://schemas.microsoft.com/office/drawing/2016/5/9/chartex" xmlns:cx4="http://schemas.microsoft.com/office/drawing/2016/5/10/chartex" xmlns:cx5="http://schemas.microsoft.com/office/drawing/2016/5/11/chartex" xmlns:cx6="http://schemas.microsoft.com/office/drawing/2016/5/12/chartex" xmlns:cx7="http://schemas.microsoft.com/office/drawing/2016/5/13/chartex" xmlns:cx8="http://schemas.microsoft.com/office/drawing/2016/5/14/chartex" xmlns:mc="http://schemas.openxmlformats.org/markup-compatibility/2006" xmlns:aink="http://schemas.microsoft.com/office/drawing/2016/ink" xmlns:am3d="http://schemas.microsoft.com/office/drawing/2017/model3d" xmlns:o="urn:schemas-microsoft-com:office:office" xmlns:oel="http://schemas.microsoft.com/office/2019/extlst" xmlns:r="http://schemas.openxmlformats.org/officeDocument/2006/relationships" xmlns:m="http://schemas.openxmlformats.org/officeDocument/2006/math" xmlns:v="urn:schemas-microsoft-com:vml" xmlns:wp14="http://schemas.microsoft.com/office/word/2010/wordprocessingDrawing" xmlns:wp="http://schemas.openxmlformats.org/drawingml/2006/wordprocessingDrawing" xmlns:w10="urn:schemas-microsoft-com:office:word" xmlns:w="http://schemas.openxmlformats.org/wordprocessingml/2006/main" xmlns:w14="http://schemas.microsoft.com/office/word/2010/wordml" xmlns:w15="http://schemas.microsoft.com/office/word/2012/wordml" xmlns:w16cex="http://schemas.microsoft.com/office/word/2018/wordml/cex" xmlns:w16cid="http://schemas.microsoft.com/office/word/2016/wordml/cid" xmlns:w16="http://schemas.microsoft.com/office/word/2018/wordml" xmlns:w16sdtdh="http://schemas.microsoft.com/office/word/2020/wordml/sdtdatahash" xmlns:w16se="http://schemas.microsoft.com/office/word/2015/wordml/symex" xmlns:wpg="http://schemas.microsoft.com/office/word/2010/wordprocessingGroup" xmlns:wpi="http://schemas.microsoft.com/office/word/2010/wordprocessingInk" xmlns:wne="http://schemas.microsoft.com/office/word/2006/wordml" xmlns:wps="http://schemas.microsoft.com/office/word/2010/wordprocessingShape" mc:Ignorable="w14 w15 w16se w16cid w16 w16cex w16sdtdh wp14">
+  <w:p>
+    <w:pPr>
+      <w:pStyle w:val="Header"/>
+    </w:pPr>
+  </w:p>
+</w:hdr>
+</file>
+
 <file path=word/numbering.xml><?xml version="1.0" encoding="utf-8"?>
-<w:numbering xmlns:wpc="http://schemas.microsoft.com/office/word/2010/wordprocessingCanvas" xmlns:cx="http://schemas.microsoft.com/office/drawing/2014/chartex" xmlns:mc="http://schemas.openxmlformats.org/markup-compatibility/2006" xmlns:o="urn:schemas-microsoft-com:office:office" xmlns:r="http://schemas.openxmlformats.org/officeDocument/2006/relationships" xmlns:m="http://schemas.openxmlformats.org/officeDocument/2006/math" xmlns:v="urn:schemas-microsoft-com:vml" xmlns:wp14="http://schemas.microsoft.com/office/word/2010/wordprocessingDrawing" xmlns:wp="http://schemas.openxmlformats.org/drawingml/2006/wordprocessingDrawing" xmlns:w10="urn:schemas-microsoft-com:office:word" xmlns:w="http://schemas.openxmlformats.org/wordprocessingml/2006/main" xmlns:w14="http://schemas.microsoft.com/office/word/2010/wordml" xmlns:w15="http://schemas.microsoft.com/office/word/2012/wordml" xmlns:w16se="http://schemas.microsoft.com/office/word/2015/wordml/symex" xmlns:wpg="http://schemas.microsoft.com/office/word/2010/wordprocessingGroup" xmlns:wpi="http://schemas.microsoft.com/office/word/2010/wordprocessingInk" xmlns:wne="http://schemas.microsoft.com/office/word/2006/wordml" xmlns:wps="http://schemas.microsoft.com/office/word/2010/wordprocessingShape" mc:Ignorable="w14 w15 w16se wp14">
+<w:numbering xmlns:wpc="http://schemas.microsoft.com/office/word/2010/wordprocessingCanvas" xmlns:cx="http://schemas.microsoft.com/office/drawing/2014/chartex" xmlns:cx1="http://schemas.microsoft.com/office/drawing/2015/9/8/chartex" xmlns:cx2="http://schemas.microsoft.com/office/drawing/2015/10/21/chartex" xmlns:cx3="http://schemas.microsoft.com/office/drawing/2016/5/9/chartex" xmlns:cx4="http://schemas.microsoft.com/office/drawing/2016/5/10/chartex" xmlns:cx5="http://schemas.microsoft.com/office/drawing/2016/5/11/chartex" xmlns:cx6="http://schemas.microsoft.com/office/drawing/2016/5/12/chartex" xmlns:cx7="http://schemas.microsoft.com/office/drawing/2016/5/13/chartex" xmlns:cx8="http://schemas.microsoft.com/office/drawing/2016/5/14/chartex" xmlns:mc="http://schemas.openxmlformats.org/markup-compatibility/2006" xmlns:aink="http://schemas.microsoft.com/office/drawing/2016/ink" xmlns:am3d="http://schemas.microsoft.com/office/drawing/2017/model3d" xmlns:o="urn:schemas-microsoft-com:office:office" xmlns:oel="http://schemas.microsoft.com/office/2019/extlst" xmlns:r="http://schemas.openxmlformats.org/officeDocument/2006/relationships" xmlns:m="http://schemas.openxmlformats.org/officeDocument/2006/math" xmlns:v="urn:schemas-microsoft-com:vml" xmlns:wp14="http://schemas.microsoft.com/office/word/2010/wordprocessingDrawing" xmlns:wp="http://schemas.openxmlformats.org/drawingml/2006/wordprocessingDrawing" xmlns:w10="urn:schemas-microsoft-com:office:word" xmlns:w="http://schemas.openxmlformats.org/wordprocessingml/2006/main" xmlns:w14="http://schemas.microsoft.com/office/word/2010/wordml" xmlns:w15="http://schemas.microsoft.com/office/word/2012/wordml" xmlns:w16cex="http://schemas.microsoft.com/office/word/2018/wordml/cex" xmlns:w16cid="http://schemas.microsoft.com/office/word/2016/wordml/cid" xmlns:w16="http://schemas.microsoft.com/office/word/2018/wordml" xmlns:w16sdtdh="http://schemas.microsoft.com/office/word/2020/wordml/sdtdatahash" xmlns:w16se="http://schemas.microsoft.com/office/word/2015/wordml/symex" xmlns:wpg="http://schemas.microsoft.com/office/word/2010/wordprocessingGroup" xmlns:wpi="http://schemas.microsoft.com/office/word/2010/wordprocessingInk" xmlns:wne="http://schemas.microsoft.com/office/word/2006/wordml" xmlns:wps="http://schemas.microsoft.com/office/word/2010/wordprocessingShape" mc:Ignorable="w14 w15 w16se w16cid w16 w16cex w16sdtdh wp14">
   <w:abstractNum w:abstractNumId="0" w15:restartNumberingAfterBreak="0">
     <w:nsid w:val="00000001"/>
     <w:multiLevelType w:val="multilevel"/>
@@ -2113,14 +2168,14 @@
       </w:pPr>
     </w:lvl>
   </w:abstractNum>
-  <w:num w:numId="1">
+  <w:num w:numId="1" w16cid:durableId="1811560301">
     <w:abstractNumId w:val="0"/>
   </w:num>
 </w:numbering>
 </file>
 
 <file path=word/styles.xml><?xml version="1.0" encoding="utf-8"?>
-<w:styles xmlns:mc="http://schemas.openxmlformats.org/markup-compatibility/2006" xmlns:r="http://schemas.openxmlformats.org/officeDocument/2006/relationships" xmlns:w="http://schemas.openxmlformats.org/wordprocessingml/2006/main" xmlns:w14="http://schemas.microsoft.com/office/word/2010/wordml" xmlns:w15="http://schemas.microsoft.com/office/word/2012/wordml" xmlns:w16se="http://schemas.microsoft.com/office/word/2015/wordml/symex" mc:Ignorable="w14 w15 w16se">
+<w:styles xmlns:mc="http://schemas.openxmlformats.org/markup-compatibility/2006" xmlns:r="http://schemas.openxmlformats.org/officeDocument/2006/relationships" xmlns:w="http://schemas.openxmlformats.org/wordprocessingml/2006/main" xmlns:w14="http://schemas.microsoft.com/office/word/2010/wordml" xmlns:w15="http://schemas.microsoft.com/office/word/2012/wordml" xmlns:w16cex="http://schemas.microsoft.com/office/word/2018/wordml/cex" xmlns:w16cid="http://schemas.microsoft.com/office/word/2016/wordml/cid" xmlns:w16="http://schemas.microsoft.com/office/word/2018/wordml" xmlns:w16sdtdh="http://schemas.microsoft.com/office/word/2020/wordml/sdtdatahash" xmlns:w16se="http://schemas.microsoft.com/office/word/2015/wordml/symex" mc:Ignorable="w14 w15 w16se w16cid w16 w16cex w16sdtdh">
   <w:docDefaults>
     <w:rPrDefault>
       <w:rPr>
@@ -2130,7 +2185,7 @@
     </w:rPrDefault>
     <w:pPrDefault/>
   </w:docDefaults>
-  <w:latentStyles w:defLockedState="0" w:defUIPriority="99" w:defSemiHidden="0" w:defUnhideWhenUsed="0" w:defQFormat="0" w:count="371">
+  <w:latentStyles w:defLockedState="0" w:defUIPriority="99" w:defSemiHidden="0" w:defUnhideWhenUsed="0" w:defQFormat="0" w:count="376">
     <w:lsdException w:name="Normal" w:uiPriority="0" w:qFormat="1"/>
     <w:lsdException w:name="heading 1" w:uiPriority="9" w:qFormat="1"/>
     <w:lsdException w:name="heading 2" w:uiPriority="9" w:qFormat="1"/>
@@ -2502,8 +2557,13 @@
     <w:lsdException w:name="List Table 5 Dark Accent 6" w:uiPriority="50"/>
     <w:lsdException w:name="List Table 6 Colorful Accent 6" w:uiPriority="51"/>
     <w:lsdException w:name="List Table 7 Colorful Accent 6" w:uiPriority="52"/>
+    <w:lsdException w:name="Mention" w:semiHidden="1" w:unhideWhenUsed="1"/>
+    <w:lsdException w:name="Smart Hyperlink" w:semiHidden="1" w:unhideWhenUsed="1"/>
+    <w:lsdException w:name="Hashtag" w:semiHidden="1" w:unhideWhenUsed="1"/>
+    <w:lsdException w:name="Unresolved Mention" w:semiHidden="1" w:unhideWhenUsed="1"/>
+    <w:lsdException w:name="Smart Link" w:semiHidden="1" w:unhideWhenUsed="1"/>
   </w:latentStyles>
-  <w:style w:type="paragraph" w:default="1" w:styleId="a">
+  <w:style w:type="paragraph" w:default="1" w:styleId="Normal">
     <w:name w:val="Normal"/>
     <w:qFormat/>
     <w:pPr>
@@ -2513,10 +2573,10 @@
       <w:lang w:eastAsia="ar-SA"/>
     </w:rPr>
   </w:style>
-  <w:style w:type="paragraph" w:styleId="1">
+  <w:style w:type="paragraph" w:styleId="Heading1">
     <w:name w:val="heading 1"/>
-    <w:basedOn w:val="a"/>
-    <w:next w:val="a"/>
+    <w:basedOn w:val="Normal"/>
+    <w:next w:val="Normal"/>
     <w:qFormat/>
     <w:pPr>
       <w:keepNext/>
@@ -2530,10 +2590,10 @@
       <w:sz w:val="24"/>
     </w:rPr>
   </w:style>
-  <w:style w:type="paragraph" w:styleId="2">
+  <w:style w:type="paragraph" w:styleId="Heading2">
     <w:name w:val="heading 2"/>
-    <w:basedOn w:val="a"/>
-    <w:next w:val="a"/>
+    <w:basedOn w:val="Normal"/>
+    <w:next w:val="Normal"/>
     <w:qFormat/>
     <w:pPr>
       <w:keepNext/>
@@ -2547,13 +2607,13 @@
       <w:b/>
     </w:rPr>
   </w:style>
-  <w:style w:type="character" w:default="1" w:styleId="a0">
+  <w:style w:type="character" w:default="1" w:styleId="DefaultParagraphFont">
     <w:name w:val="Default Paragraph Font"/>
     <w:uiPriority w:val="1"/>
     <w:semiHidden/>
     <w:unhideWhenUsed/>
   </w:style>
-  <w:style w:type="table" w:default="1" w:styleId="a1">
+  <w:style w:type="table" w:default="1" w:styleId="TableNormal">
     <w:name w:val="Normal Table"/>
     <w:uiPriority w:val="99"/>
     <w:semiHidden/>
@@ -2568,7 +2628,7 @@
       </w:tblCellMar>
     </w:tblPr>
   </w:style>
-  <w:style w:type="numbering" w:default="1" w:styleId="a2">
+  <w:style w:type="numbering" w:default="1" w:styleId="NoList">
     <w:name w:val="No List"/>
     <w:uiPriority w:val="99"/>
     <w:semiHidden/>
@@ -2628,13 +2688,13 @@
       <w:rFonts w:ascii="Symbol" w:hAnsi="Symbol" w:cs="Symbol"/>
     </w:rPr>
   </w:style>
-  <w:style w:type="character" w:customStyle="1" w:styleId="10">
+  <w:style w:type="character" w:customStyle="1" w:styleId="1">
     <w:name w:val="Основной шрифт абзаца1"/>
   </w:style>
-  <w:style w:type="paragraph" w:customStyle="1" w:styleId="11">
+  <w:style w:type="paragraph" w:customStyle="1" w:styleId="10">
     <w:name w:val="Заголовок1"/>
-    <w:basedOn w:val="a"/>
-    <w:next w:val="a3"/>
+    <w:basedOn w:val="Normal"/>
+    <w:next w:val="BodyText"/>
     <w:pPr>
       <w:keepNext/>
       <w:spacing w:before="240" w:after="120"/>
@@ -2645,23 +2705,23 @@
       <w:szCs w:val="28"/>
     </w:rPr>
   </w:style>
-  <w:style w:type="paragraph" w:styleId="a3">
+  <w:style w:type="paragraph" w:styleId="BodyText">
     <w:name w:val="Body Text"/>
-    <w:basedOn w:val="a"/>
+    <w:basedOn w:val="Normal"/>
     <w:pPr>
       <w:spacing w:after="120"/>
     </w:pPr>
   </w:style>
-  <w:style w:type="paragraph" w:styleId="a4">
+  <w:style w:type="paragraph" w:styleId="List">
     <w:name w:val="List"/>
-    <w:basedOn w:val="a3"/>
+    <w:basedOn w:val="BodyText"/>
     <w:rPr>
       <w:rFonts w:cs="Tahoma"/>
     </w:rPr>
   </w:style>
-  <w:style w:type="paragraph" w:customStyle="1" w:styleId="12">
+  <w:style w:type="paragraph" w:customStyle="1" w:styleId="11">
     <w:name w:val="Название1"/>
-    <w:basedOn w:val="a"/>
+    <w:basedOn w:val="Normal"/>
     <w:pPr>
       <w:suppressLineNumbers/>
       <w:spacing w:before="120" w:after="120"/>
@@ -2674,9 +2734,9 @@
       <w:szCs w:val="24"/>
     </w:rPr>
   </w:style>
-  <w:style w:type="paragraph" w:customStyle="1" w:styleId="13">
+  <w:style w:type="paragraph" w:customStyle="1" w:styleId="12">
     <w:name w:val="Указатель1"/>
-    <w:basedOn w:val="a"/>
+    <w:basedOn w:val="Normal"/>
     <w:pPr>
       <w:suppressLineNumbers/>
     </w:pPr>
@@ -2684,14 +2744,14 @@
       <w:rFonts w:cs="Tahoma"/>
     </w:rPr>
   </w:style>
-  <w:style w:type="paragraph" w:customStyle="1" w:styleId="a5">
+  <w:style w:type="paragraph" w:customStyle="1" w:styleId="a">
     <w:name w:val="Содержимое врезки"/>
-    <w:basedOn w:val="a3"/>
-  </w:style>
-  <w:style w:type="paragraph" w:styleId="a6">
+    <w:basedOn w:val="BodyText"/>
+  </w:style>
+  <w:style w:type="paragraph" w:styleId="BalloonText">
     <w:name w:val="Balloon Text"/>
-    <w:basedOn w:val="a"/>
-    <w:link w:val="a7"/>
+    <w:basedOn w:val="Normal"/>
+    <w:link w:val="BalloonTextChar"/>
     <w:uiPriority w:val="99"/>
     <w:semiHidden/>
     <w:unhideWhenUsed/>
@@ -2702,9 +2762,9 @@
       <w:szCs w:val="18"/>
     </w:rPr>
   </w:style>
-  <w:style w:type="character" w:customStyle="1" w:styleId="a7">
-    <w:name w:val="Текст выноски Знак"/>
-    <w:link w:val="a6"/>
+  <w:style w:type="character" w:customStyle="1" w:styleId="BalloonTextChar">
+    <w:name w:val="Balloon Text Char"/>
+    <w:link w:val="BalloonText"/>
     <w:uiPriority w:val="99"/>
     <w:semiHidden/>
     <w:rsid w:val="004B5AE7"/>
@@ -2715,9 +2775,9 @@
       <w:lang w:eastAsia="ar-SA"/>
     </w:rPr>
   </w:style>
-  <w:style w:type="table" w:styleId="a8">
+  <w:style w:type="table" w:styleId="TableGrid">
     <w:name w:val="Table Grid"/>
-    <w:basedOn w:val="a1"/>
+    <w:basedOn w:val="TableNormal"/>
     <w:uiPriority w:val="59"/>
     <w:rsid w:val="003750C7"/>
     <w:rPr>
@@ -2737,14 +2797,62 @@
       </w:tblBorders>
     </w:tblPr>
   </w:style>
-  <w:style w:type="character" w:styleId="a9">
+  <w:style w:type="character" w:styleId="PlaceholderText">
     <w:name w:val="Placeholder Text"/>
-    <w:basedOn w:val="a0"/>
+    <w:basedOn w:val="DefaultParagraphFont"/>
     <w:uiPriority w:val="99"/>
     <w:semiHidden/>
     <w:rsid w:val="00162E20"/>
     <w:rPr>
       <w:color w:val="808080"/>
+    </w:rPr>
+  </w:style>
+  <w:style w:type="paragraph" w:styleId="Header">
+    <w:name w:val="header"/>
+    <w:basedOn w:val="Normal"/>
+    <w:link w:val="HeaderChar"/>
+    <w:uiPriority w:val="99"/>
+    <w:unhideWhenUsed/>
+    <w:rsid w:val="00522B20"/>
+    <w:pPr>
+      <w:tabs>
+        <w:tab w:val="center" w:pos="4680"/>
+        <w:tab w:val="right" w:pos="9360"/>
+      </w:tabs>
+    </w:pPr>
+  </w:style>
+  <w:style w:type="character" w:customStyle="1" w:styleId="HeaderChar">
+    <w:name w:val="Header Char"/>
+    <w:basedOn w:val="DefaultParagraphFont"/>
+    <w:link w:val="Header"/>
+    <w:uiPriority w:val="99"/>
+    <w:rsid w:val="00522B20"/>
+    <w:rPr>
+      <w:lang w:eastAsia="ar-SA"/>
+    </w:rPr>
+  </w:style>
+  <w:style w:type="paragraph" w:styleId="Footer">
+    <w:name w:val="footer"/>
+    <w:basedOn w:val="Normal"/>
+    <w:link w:val="FooterChar"/>
+    <w:uiPriority w:val="99"/>
+    <w:unhideWhenUsed/>
+    <w:rsid w:val="00522B20"/>
+    <w:pPr>
+      <w:tabs>
+        <w:tab w:val="center" w:pos="4680"/>
+        <w:tab w:val="right" w:pos="9360"/>
+      </w:tabs>
+    </w:pPr>
+  </w:style>
+  <w:style w:type="character" w:customStyle="1" w:styleId="FooterChar">
+    <w:name w:val="Footer Char"/>
+    <w:basedOn w:val="DefaultParagraphFont"/>
+    <w:link w:val="Footer"/>
+    <w:uiPriority w:val="99"/>
+    <w:rsid w:val="00522B20"/>
+    <w:rPr>
+      <w:lang w:eastAsia="ar-SA"/>
     </w:rPr>
   </w:style>
 </w:styles>

</xml_diff>

<commit_message>
Adds a distinction between the formatted profession and the simple profession name
</commit_message>
<xml_diff>
--- a/templates/roza_ud.docx
+++ b/templates/roza_ud.docx
@@ -432,23 +432,13 @@
                 <w:sz w:val="24"/>
               </w:rPr>
             </w:pPr>
-            <w:proofErr w:type="spellStart"/>
-            <w:r>
-              <w:rPr>
-                <w:b/>
-                <w:bCs/>
-                <w:sz w:val="24"/>
-              </w:rPr>
-              <w:t>Выдано</w:t>
-            </w:r>
-            <w:proofErr w:type="spellEnd"/>
-            <w:r>
-              <w:rPr>
-                <w:b/>
-                <w:bCs/>
-                <w:sz w:val="24"/>
-              </w:rPr>
-              <w:t xml:space="preserve"> </w:t>
+            <w:r>
+              <w:rPr>
+                <w:b/>
+                <w:bCs/>
+                <w:sz w:val="24"/>
+              </w:rPr>
+              <w:t xml:space="preserve">Выдано </w:t>
             </w:r>
             <w:proofErr w:type="gramStart"/>
             <w:r>
@@ -457,16 +447,7 @@
                 <w:bCs/>
                 <w:sz w:val="24"/>
               </w:rPr>
-              <w:t xml:space="preserve">{{ </w:t>
-            </w:r>
-            <w:proofErr w:type="spellStart"/>
-            <w:r>
-              <w:rPr>
-                <w:b/>
-                <w:bCs/>
-                <w:sz w:val="24"/>
-              </w:rPr>
-              <w:t>end</w:t>
+              <w:t>{{ end</w:t>
             </w:r>
             <w:proofErr w:type="gramEnd"/>
             <w:r>
@@ -475,16 +456,7 @@
                 <w:bCs/>
                 <w:sz w:val="24"/>
               </w:rPr>
-              <w:t>_date</w:t>
-            </w:r>
-            <w:proofErr w:type="spellEnd"/>
-            <w:r>
-              <w:rPr>
-                <w:b/>
-                <w:bCs/>
-                <w:sz w:val="24"/>
-              </w:rPr>
-              <w:t xml:space="preserve"> }}</w:t>
+              <w:t>_date }}</w:t>
             </w:r>
           </w:p>
         </w:tc>
@@ -589,70 +561,30 @@
                 <w:bCs/>
               </w:rPr>
             </w:pPr>
-            <w:proofErr w:type="gramStart"/>
-            <w:r>
-              <w:rPr>
-                <w:b/>
-                <w:bCs/>
-                <w:sz w:val="24"/>
-              </w:rPr>
-              <w:t xml:space="preserve">{{ </w:t>
-            </w:r>
-            <w:proofErr w:type="spellStart"/>
-            <w:r>
-              <w:rPr>
-                <w:b/>
-                <w:bCs/>
-                <w:sz w:val="24"/>
-              </w:rPr>
-              <w:t>student</w:t>
-            </w:r>
-            <w:proofErr w:type="gramEnd"/>
-            <w:r>
-              <w:rPr>
-                <w:b/>
-                <w:bCs/>
-                <w:sz w:val="24"/>
-              </w:rPr>
-              <w:t>_profession</w:t>
-            </w:r>
-            <w:proofErr w:type="spellEnd"/>
-            <w:r>
-              <w:rPr>
-                <w:b/>
-                <w:bCs/>
-                <w:sz w:val="24"/>
-              </w:rPr>
-              <w:t xml:space="preserve"> }}, {{ </w:t>
-            </w:r>
-            <w:proofErr w:type="spellStart"/>
-            <w:r>
-              <w:rPr>
-                <w:b/>
-                <w:bCs/>
-                <w:sz w:val="24"/>
-              </w:rPr>
-              <w:t>razryad</w:t>
-            </w:r>
-            <w:proofErr w:type="spellEnd"/>
-            <w:r>
-              <w:rPr>
-                <w:b/>
-                <w:bCs/>
-                <w:sz w:val="24"/>
-              </w:rPr>
-              <w:t xml:space="preserve"> }} </w:t>
-            </w:r>
-            <w:proofErr w:type="spellStart"/>
-            <w:r>
-              <w:rPr>
-                <w:b/>
-                <w:bCs/>
-                <w:sz w:val="24"/>
-              </w:rPr>
-              <w:t>разряд</w:t>
-            </w:r>
-            <w:proofErr w:type="spellEnd"/>
+            <w:r>
+              <w:rPr>
+                <w:b/>
+                <w:bCs/>
+                <w:sz w:val="24"/>
+              </w:rPr>
+              <w:t>{{ profession</w:t>
+            </w:r>
+            <w:r>
+              <w:rPr>
+                <w:b/>
+                <w:bCs/>
+                <w:sz w:val="24"/>
+              </w:rPr>
+              <w:t>_name</w:t>
+            </w:r>
+            <w:r>
+              <w:rPr>
+                <w:b/>
+                <w:bCs/>
+                <w:sz w:val="24"/>
+              </w:rPr>
+              <w:t xml:space="preserve"> }}, {{ razryad }} разряд</w:t>
+            </w:r>
           </w:p>
         </w:tc>
       </w:tr>
@@ -1271,7 +1203,6 @@
                 <w:szCs w:val="22"/>
               </w:rPr>
             </w:pPr>
-            <w:proofErr w:type="spellStart"/>
             <w:r>
               <w:rPr>
                 <w:rFonts w:eastAsia="Calibri"/>
@@ -1280,7 +1211,6 @@
               </w:rPr>
               <w:t>Председатель</w:t>
             </w:r>
-            <w:proofErr w:type="spellEnd"/>
           </w:p>
           <w:p>
             <w:pPr>
@@ -1292,81 +1222,43 @@
                 <w:szCs w:val="22"/>
               </w:rPr>
             </w:pPr>
-            <w:proofErr w:type="spellStart"/>
             <w:r>
               <w:rPr>
                 <w:rFonts w:eastAsia="Calibri"/>
                 <w:sz w:val="22"/>
                 <w:szCs w:val="22"/>
               </w:rPr>
-              <w:t>квалификационной</w:t>
-            </w:r>
-            <w:proofErr w:type="spellEnd"/>
+              <w:t xml:space="preserve">квалификационной комиссии </w:t>
+            </w:r>
+            <w:r>
+              <w:tab/>
+            </w:r>
             <w:r>
               <w:rPr>
                 <w:rFonts w:eastAsia="Calibri"/>
                 <w:sz w:val="22"/>
                 <w:szCs w:val="22"/>
               </w:rPr>
-              <w:t xml:space="preserve"> </w:t>
-            </w:r>
-            <w:proofErr w:type="spellStart"/>
+              <w:t>____________</w:t>
+            </w:r>
+          </w:p>
+          <w:p>
+            <w:pPr>
+              <w:rPr>
+                <w:rFonts w:eastAsia="Calibri"/>
+                <w:sz w:val="24"/>
+                <w:szCs w:val="22"/>
+                <w:lang w:val="ru-RU"/>
+              </w:rPr>
+            </w:pPr>
             <w:r>
               <w:rPr>
                 <w:rFonts w:eastAsia="Calibri"/>
                 <w:sz w:val="22"/>
                 <w:szCs w:val="22"/>
               </w:rPr>
-              <w:t>комиссии</w:t>
-            </w:r>
-            <w:proofErr w:type="spellEnd"/>
-            <w:r>
-              <w:rPr>
-                <w:rFonts w:eastAsia="Calibri"/>
-                <w:sz w:val="22"/>
-                <w:szCs w:val="22"/>
-              </w:rPr>
-              <w:t xml:space="preserve"> </w:t>
-            </w:r>
-            <w:r>
-              <w:tab/>
-            </w:r>
-            <w:r>
-              <w:rPr>
-                <w:rFonts w:eastAsia="Calibri"/>
-                <w:sz w:val="22"/>
-                <w:szCs w:val="22"/>
-              </w:rPr>
-              <w:t>____________</w:t>
-            </w:r>
-          </w:p>
-          <w:p>
-            <w:pPr>
-              <w:rPr>
-                <w:rFonts w:eastAsia="Calibri"/>
-                <w:sz w:val="24"/>
-                <w:szCs w:val="22"/>
-                <w:lang w:val="ru-RU"/>
-              </w:rPr>
-            </w:pPr>
-            <w:r>
-              <w:rPr>
-                <w:rFonts w:eastAsia="Calibri"/>
-                <w:sz w:val="22"/>
-                <w:szCs w:val="22"/>
-              </w:rPr>
-              <w:t xml:space="preserve">         </w:t>
-            </w:r>
-            <w:proofErr w:type="spellStart"/>
-            <w:r>
-              <w:rPr>
-                <w:rFonts w:eastAsia="Calibri"/>
-                <w:sz w:val="22"/>
-                <w:szCs w:val="22"/>
-              </w:rPr>
-              <w:t>Директор</w:t>
-            </w:r>
-            <w:proofErr w:type="spellEnd"/>
+              <w:t xml:space="preserve">         Директор</w:t>
+            </w:r>
             <w:r>
               <w:tab/>
             </w:r>

</xml_diff>